<commit_message>
Add prototype documentation assets
Updated the lab report and added the physical prototype image in both the docs and figures folders to document the prototype and support the report.
</commit_message>
<xml_diff>
--- a/docs/lab_report.docx
+++ b/docs/lab_report.docx
@@ -185,6 +185,53 @@
       </w:pPr>
       <w:r>
         <w:t>Figure 1(b): The ESP32 board used: DFRobot FireBeetle Board-ESP32 (V4.0).</w:t>
+      </w:r>
+    </w:p>
+    <w:p>
+      <w:pPr>
+        <w:jc w:val="center"/>
+      </w:pPr>
+      <w:r>
+        <w:drawing>
+          <wp:inline xmlns:a="http://schemas.openxmlformats.org/drawingml/2006/main" xmlns:pic="http://schemas.openxmlformats.org/drawingml/2006/picture">
+            <wp:extent cx="3291840" cy="4081730"/>
+            <wp:docPr id="3" name="Picture 3"/>
+            <wp:cNvGraphicFramePr>
+              <a:graphicFrameLocks noChangeAspect="1"/>
+            </wp:cNvGraphicFramePr>
+            <a:graphic>
+              <a:graphicData uri="http://schemas.openxmlformats.org/drawingml/2006/picture">
+                <pic:pic>
+                  <pic:nvPicPr>
+                    <pic:cNvPr id="0" name="physical_prototype.jpg"/>
+                    <pic:cNvPicPr/>
+                  </pic:nvPicPr>
+                  <pic:blipFill>
+                    <a:blip r:embed="rId11"/>
+                    <a:stretch>
+                      <a:fillRect/>
+                    </a:stretch>
+                  </pic:blipFill>
+                  <pic:spPr>
+                    <a:xfrm>
+                      <a:off x="0" y="0"/>
+                      <a:ext cx="3291840" cy="4081730"/>
+                    </a:xfrm>
+                    <a:prstGeom prst="rect"/>
+                  </pic:spPr>
+                </pic:pic>
+              </a:graphicData>
+            </a:graphic>
+          </wp:inline>
+        </w:drawing>
+      </w:r>
+    </w:p>
+    <w:p>
+      <w:pPr>
+        <w:jc w:val="center"/>
+      </w:pPr>
+      <w:r>
+        <w:t>Figure 1(c): The assembled prototype: ESP32 on a breadboard with the LDR and buzzer, and the DHT11 and LM35 sensor modules connected by jumper wires.</w:t>
       </w:r>
     </w:p>
     <w:p>
@@ -815,7 +862,7 @@
         <w:drawing>
           <wp:inline xmlns:a="http://schemas.openxmlformats.org/drawingml/2006/main" xmlns:pic="http://schemas.openxmlformats.org/drawingml/2006/picture">
             <wp:extent cx="4206240" cy="7617501"/>
-            <wp:docPr id="3" name="Picture 3"/>
+            <wp:docPr id="4" name="Picture 4"/>
             <wp:cNvGraphicFramePr>
               <a:graphicFrameLocks noChangeAspect="1"/>
             </wp:cNvGraphicFramePr>
@@ -827,7 +874,7 @@
                     <pic:cNvPicPr/>
                   </pic:nvPicPr>
                   <pic:blipFill>
-                    <a:blip r:embed="rId11"/>
+                    <a:blip r:embed="rId12"/>
                     <a:stretch>
                       <a:fillRect/>
                     </a:stretch>
@@ -886,7 +933,7 @@
         <w:drawing>
           <wp:inline xmlns:a="http://schemas.openxmlformats.org/drawingml/2006/main" xmlns:pic="http://schemas.openxmlformats.org/drawingml/2006/picture">
             <wp:extent cx="4572000" cy="3229950"/>
-            <wp:docPr id="4" name="Picture 4"/>
+            <wp:docPr id="5" name="Picture 5"/>
             <wp:cNvGraphicFramePr>
               <a:graphicFrameLocks noChangeAspect="1"/>
             </wp:cNvGraphicFramePr>
@@ -898,7 +945,7 @@
                     <pic:cNvPicPr/>
                   </pic:nvPicPr>
                   <pic:blipFill>
-                    <a:blip r:embed="rId12"/>
+                    <a:blip r:embed="rId13"/>
                     <a:stretch>
                       <a:fillRect/>
                     </a:stretch>
@@ -1492,7 +1539,7 @@
         <w:drawing>
           <wp:inline xmlns:a="http://schemas.openxmlformats.org/drawingml/2006/main" xmlns:pic="http://schemas.openxmlformats.org/drawingml/2006/picture">
             <wp:extent cx="4754880" cy="2769326"/>
-            <wp:docPr id="5" name="Picture 5"/>
+            <wp:docPr id="6" name="Picture 6"/>
             <wp:cNvGraphicFramePr>
               <a:graphicFrameLocks noChangeAspect="1"/>
             </wp:cNvGraphicFramePr>
@@ -1504,7 +1551,7 @@
                     <pic:cNvPicPr/>
                   </pic:nvPicPr>
                   <pic:blipFill>
-                    <a:blip r:embed="rId13"/>
+                    <a:blip r:embed="rId14"/>
                     <a:stretch>
                       <a:fillRect/>
                     </a:stretch>
@@ -1539,7 +1586,7 @@
         <w:drawing>
           <wp:inline xmlns:a="http://schemas.openxmlformats.org/drawingml/2006/main" xmlns:pic="http://schemas.openxmlformats.org/drawingml/2006/picture">
             <wp:extent cx="4754880" cy="2699657"/>
-            <wp:docPr id="6" name="Picture 6"/>
+            <wp:docPr id="7" name="Picture 7"/>
             <wp:cNvGraphicFramePr>
               <a:graphicFrameLocks noChangeAspect="1"/>
             </wp:cNvGraphicFramePr>
@@ -1551,7 +1598,7 @@
                     <pic:cNvPicPr/>
                   </pic:nvPicPr>
                   <pic:blipFill>
-                    <a:blip r:embed="rId14"/>
+                    <a:blip r:embed="rId15"/>
                     <a:stretch>
                       <a:fillRect/>
                     </a:stretch>
@@ -1586,7 +1633,7 @@
         <w:drawing>
           <wp:inline xmlns:a="http://schemas.openxmlformats.org/drawingml/2006/main" xmlns:pic="http://schemas.openxmlformats.org/drawingml/2006/picture">
             <wp:extent cx="4754880" cy="2691639"/>
-            <wp:docPr id="7" name="Picture 7"/>
+            <wp:docPr id="8" name="Picture 8"/>
             <wp:cNvGraphicFramePr>
               <a:graphicFrameLocks noChangeAspect="1"/>
             </wp:cNvGraphicFramePr>
@@ -1598,7 +1645,7 @@
                     <pic:cNvPicPr/>
                   </pic:nvPicPr>
                   <pic:blipFill>
-                    <a:blip r:embed="rId15"/>
+                    <a:blip r:embed="rId16"/>
                     <a:stretch>
                       <a:fillRect/>
                     </a:stretch>
@@ -1633,7 +1680,7 @@
         <w:drawing>
           <wp:inline xmlns:a="http://schemas.openxmlformats.org/drawingml/2006/main" xmlns:pic="http://schemas.openxmlformats.org/drawingml/2006/picture">
             <wp:extent cx="4754880" cy="2676821"/>
-            <wp:docPr id="8" name="Picture 8"/>
+            <wp:docPr id="9" name="Picture 9"/>
             <wp:cNvGraphicFramePr>
               <a:graphicFrameLocks noChangeAspect="1"/>
             </wp:cNvGraphicFramePr>
@@ -1645,7 +1692,7 @@
                     <pic:cNvPicPr/>
                   </pic:nvPicPr>
                   <pic:blipFill>
-                    <a:blip r:embed="rId16"/>
+                    <a:blip r:embed="rId17"/>
                     <a:stretch>
                       <a:fillRect/>
                     </a:stretch>
@@ -1696,7 +1743,7 @@
         <w:drawing>
           <wp:inline xmlns:a="http://schemas.openxmlformats.org/drawingml/2006/main" xmlns:pic="http://schemas.openxmlformats.org/drawingml/2006/picture">
             <wp:extent cx="5486400" cy="2194560"/>
-            <wp:docPr id="9" name="Picture 9"/>
+            <wp:docPr id="10" name="Picture 10"/>
             <wp:cNvGraphicFramePr>
               <a:graphicFrameLocks noChangeAspect="1"/>
             </wp:cNvGraphicFramePr>
@@ -1708,7 +1755,7 @@
                     <pic:cNvPicPr/>
                   </pic:nvPicPr>
                   <pic:blipFill>
-                    <a:blip r:embed="rId17"/>
+                    <a:blip r:embed="rId18"/>
                     <a:stretch>
                       <a:fillRect/>
                     </a:stretch>
@@ -1743,7 +1790,7 @@
         <w:drawing>
           <wp:inline xmlns:a="http://schemas.openxmlformats.org/drawingml/2006/main" xmlns:pic="http://schemas.openxmlformats.org/drawingml/2006/picture">
             <wp:extent cx="5486400" cy="2194560"/>
-            <wp:docPr id="10" name="Picture 10"/>
+            <wp:docPr id="11" name="Picture 11"/>
             <wp:cNvGraphicFramePr>
               <a:graphicFrameLocks noChangeAspect="1"/>
             </wp:cNvGraphicFramePr>
@@ -1755,7 +1802,7 @@
                     <pic:cNvPicPr/>
                   </pic:nvPicPr>
                   <pic:blipFill>
-                    <a:blip r:embed="rId18"/>
+                    <a:blip r:embed="rId19"/>
                     <a:stretch>
                       <a:fillRect/>
                     </a:stretch>
@@ -1790,7 +1837,7 @@
         <w:drawing>
           <wp:inline xmlns:a="http://schemas.openxmlformats.org/drawingml/2006/main" xmlns:pic="http://schemas.openxmlformats.org/drawingml/2006/picture">
             <wp:extent cx="5486400" cy="2194560"/>
-            <wp:docPr id="11" name="Picture 11"/>
+            <wp:docPr id="12" name="Picture 12"/>
             <wp:cNvGraphicFramePr>
               <a:graphicFrameLocks noChangeAspect="1"/>
             </wp:cNvGraphicFramePr>
@@ -1802,7 +1849,7 @@
                     <pic:cNvPicPr/>
                   </pic:nvPicPr>
                   <pic:blipFill>
-                    <a:blip r:embed="rId19"/>
+                    <a:blip r:embed="rId20"/>
                     <a:stretch>
                       <a:fillRect/>
                     </a:stretch>
@@ -1837,7 +1884,7 @@
         <w:drawing>
           <wp:inline xmlns:a="http://schemas.openxmlformats.org/drawingml/2006/main" xmlns:pic="http://schemas.openxmlformats.org/drawingml/2006/picture">
             <wp:extent cx="5486400" cy="2194560"/>
-            <wp:docPr id="12" name="Picture 12"/>
+            <wp:docPr id="13" name="Picture 13"/>
             <wp:cNvGraphicFramePr>
               <a:graphicFrameLocks noChangeAspect="1"/>
             </wp:cNvGraphicFramePr>
@@ -1849,7 +1896,7 @@
                     <pic:cNvPicPr/>
                   </pic:nvPicPr>
                   <pic:blipFill>
-                    <a:blip r:embed="rId20"/>
+                    <a:blip r:embed="rId21"/>
                     <a:stretch>
                       <a:fillRect/>
                     </a:stretch>
@@ -1884,7 +1931,7 @@
         <w:drawing>
           <wp:inline xmlns:a="http://schemas.openxmlformats.org/drawingml/2006/main" xmlns:pic="http://schemas.openxmlformats.org/drawingml/2006/picture">
             <wp:extent cx="5486400" cy="2743200"/>
-            <wp:docPr id="13" name="Picture 13"/>
+            <wp:docPr id="14" name="Picture 14"/>
             <wp:cNvGraphicFramePr>
               <a:graphicFrameLocks noChangeAspect="1"/>
             </wp:cNvGraphicFramePr>
@@ -1896,7 +1943,7 @@
                     <pic:cNvPicPr/>
                   </pic:nvPicPr>
                   <pic:blipFill>
-                    <a:blip r:embed="rId21"/>
+                    <a:blip r:embed="rId22"/>
                     <a:stretch>
                       <a:fillRect/>
                     </a:stretch>
@@ -1931,7 +1978,7 @@
         <w:drawing>
           <wp:inline xmlns:a="http://schemas.openxmlformats.org/drawingml/2006/main" xmlns:pic="http://schemas.openxmlformats.org/drawingml/2006/picture">
             <wp:extent cx="5486400" cy="1995055"/>
-            <wp:docPr id="14" name="Picture 14"/>
+            <wp:docPr id="15" name="Picture 15"/>
             <wp:cNvGraphicFramePr>
               <a:graphicFrameLocks noChangeAspect="1"/>
             </wp:cNvGraphicFramePr>
@@ -1943,7 +1990,7 @@
                     <pic:cNvPicPr/>
                   </pic:nvPicPr>
                   <pic:blipFill>
-                    <a:blip r:embed="rId22"/>
+                    <a:blip r:embed="rId23"/>
                     <a:stretch>
                       <a:fillRect/>
                     </a:stretch>

</xml_diff>